<commit_message>
fix: handle non-teaching RPH weeks
</commit_message>
<xml_diff>
--- a/curriculum/rpt/RPT_Pendidikan_Moral_Tahun1_2026_KumpulanB_SourceFirst.docx
+++ b/curriculum/rpt/RPT_Pendidikan_Moral_Tahun1_2026_KumpulanB_SourceFirst.docx
@@ -10602,18 +10602,8 @@
             <w:tcW w:w="1842" w:type="dxa"/>
           </w:tcPr>
           <w:p>
-            <w:pPr>
-              <w:spacing w:before="0" w:after="0" w:line="240" w:lineRule="auto"/>
-              <w:jc w:val="left"/>
-            </w:pPr>
-            <w:r>
-              <w:rPr>
-                <w:rFonts w:ascii="Arial" w:hAnsi="Arial" w:cs="DejaVu Sans"/>
-                <w:b w:val="0"/>
-                <w:color w:val="000000"/>
-                <w:sz w:val="14"/>
-              </w:rPr>
-              <w:t>UASA / pentaksiran sekolah</w:t>
+            <w:r>
+              <w:t>NO - UASA</w:t>
             </w:r>
           </w:p>
         </w:tc>
@@ -10839,18 +10829,8 @@
             <w:tcW w:w="1842" w:type="dxa"/>
           </w:tcPr>
           <w:p>
-            <w:pPr>
-              <w:spacing w:before="0" w:after="0" w:line="240" w:lineRule="auto"/>
-              <w:jc w:val="left"/>
-            </w:pPr>
-            <w:r>
-              <w:rPr>
-                <w:rFonts w:ascii="Arial" w:hAnsi="Arial" w:cs="DejaVu Sans"/>
-                <w:b w:val="0"/>
-                <w:color w:val="000000"/>
-                <w:sz w:val="14"/>
-              </w:rPr>
-              <w:t>UASA / pentaksiran sekolah</w:t>
+            <w:r>
+              <w:t>NO - UASA</w:t>
             </w:r>
           </w:p>
         </w:tc>
@@ -11068,18 +11048,8 @@
             <w:tcW w:w="1842" w:type="dxa"/>
           </w:tcPr>
           <w:p>
-            <w:pPr>
-              <w:spacing w:before="0" w:after="0" w:line="240" w:lineRule="auto"/>
-              <w:jc w:val="left"/>
-            </w:pPr>
-            <w:r>
-              <w:rPr>
-                <w:rFonts w:ascii="Arial" w:hAnsi="Arial" w:cs="DejaVu Sans"/>
-                <w:b w:val="0"/>
-                <w:color w:val="000000"/>
-                <w:sz w:val="14"/>
-              </w:rPr>
-              <w:t>Pengukuhan / refleksi</w:t>
+            <w:r>
+              <w:t>NO - pengurusan akhir tahun</w:t>
             </w:r>
           </w:p>
         </w:tc>
@@ -11305,18 +11275,8 @@
             <w:tcW w:w="1842" w:type="dxa"/>
           </w:tcPr>
           <w:p>
-            <w:pPr>
-              <w:spacing w:before="0" w:after="0" w:line="240" w:lineRule="auto"/>
-              <w:jc w:val="left"/>
-            </w:pPr>
-            <w:r>
-              <w:rPr>
-                <w:rFonts w:ascii="Arial" w:hAnsi="Arial" w:cs="DejaVu Sans"/>
-                <w:b w:val="0"/>
-                <w:color w:val="000000"/>
-                <w:sz w:val="14"/>
-              </w:rPr>
-              <w:t>Pengukuhan / refleksi</w:t>
+            <w:r>
+              <w:t>NO - pengurusan akhir tahun</w:t>
             </w:r>
           </w:p>
         </w:tc>
@@ -11534,18 +11494,8 @@
             <w:tcW w:w="1842" w:type="dxa"/>
           </w:tcPr>
           <w:p>
-            <w:pPr>
-              <w:spacing w:before="0" w:after="0" w:line="240" w:lineRule="auto"/>
-              <w:jc w:val="left"/>
-            </w:pPr>
-            <w:r>
-              <w:rPr>
-                <w:rFonts w:ascii="Arial" w:hAnsi="Arial" w:cs="DejaVu Sans"/>
-                <w:b w:val="0"/>
-                <w:color w:val="000000"/>
-                <w:sz w:val="14"/>
-              </w:rPr>
-              <w:t>Pengukuhan / refleksi</w:t>
+            <w:r>
+              <w:t>NO - pengurusan akhir tahun</w:t>
             </w:r>
           </w:p>
         </w:tc>
@@ -11660,22 +11610,7 @@
         <w:ind w:left="312" w:hanging="198"/>
       </w:pPr>
       <w:r>
-        <w:rPr>
-          <w:rFonts w:ascii="Arial" w:hAnsi="Arial" w:cs="DejaVu Sans"/>
-          <w:b/>
-          <w:color w:val="0F6B73"/>
-          <w:sz w:val="18"/>
-        </w:rPr>
-        <w:t xml:space="preserve">• </w:t>
-      </w:r>
-      <w:r>
-        <w:rPr>
-          <w:rFonts w:ascii="Arial" w:hAnsi="Arial" w:cs="DejaVu Sans"/>
-          <w:b w:val="0"/>
-          <w:color w:val="1F2937"/>
-          <w:sz w:val="18"/>
-        </w:rPr>
-        <w:t>Lesson Map kekal draf sehingga guru mengesahkan minggu, SK/SP, halaman bercetak dan tugasan sumber.</w:t>
+        <w:t>• Minggu 39-40 ialah UASA; Minggu 41-43 ialah pengurusan akhir tahun. Semua minggu ini ditanda NO dan tidak menjana RPH biasa secara automatik.</w:t>
       </w:r>
     </w:p>
     <w:p>

</xml_diff>